<commit_message>
feat: ajout 6 documents OHADA (batch 3) - SNC, SCS, fusions, notification
Nouveaux statuts :
- Statuts SNC - Société en Nom Collectif (modèle 1, 26 articles)
- Statuts SCS - Société en Commandite Simple (modèle 2, 24 articles)

Fusion :
- Projet de fusion avec participation absorbante/absorbée (modèle 44, fusion-renonciation)
- Projet de fusion par constitution de société nouvelle (modèle 43, 3 sociétés A+B→C)

Divers :
- Lettre notification représentant permanent SA (modèle 26)
- MAJ avis convocation AG SA (ajout mention sociétés faisant appel public à l'épargne)

Total : 57 documents juridiques OHADA disponibles.

Co-Authored-By: Claude Opus 4.6 (1M context) <noreply@anthropic.com>
</commit_message>
<xml_diff>
--- a/server/templates/avis-convocation-ag-sa/avis.docx
+++ b/server/templates/avis-convocation-ag-sa/avis.docx
@@ -257,6 +257,41 @@
           <w:szCs w:val="24"/>
         </w:rPr>
         <w:t xml:space="preserve">Le droit de participer à l’assemblée sera subordonné à l’inscription des actions au nom de l’actionnaire au jour de l’assemblée générale dans le registre des titres nominatifs tenus par la société.</w:t>
+      </w:r>
+    </w:p>
+    <w:p>
+      <w:pPr>
+        <w:jc w:val="both"/>
+        <w:spacing w:after="120" w:line="276" w:lineRule="auto"/>
+        <w:rPr>
+          <w:rFonts w:ascii="Times New Roman" w:hAnsi="Times New Roman" w:cs="Times New Roman"/>
+        </w:rPr>
+      </w:pPr>
+      <w:r>
+        <w:rPr>
+          <w:rFonts w:ascii="Times New Roman" w:hAnsi="Times New Roman" w:cs="Times New Roman"/>
+          <w:sz w:val="24"/>
+          <w:szCs w:val="24"/>
+        </w:rPr>
+        <w:t xml:space="preserve"/>
+      </w:r>
+    </w:p>
+    <w:p>
+      <w:pPr>
+        <w:jc w:val="both"/>
+        <w:spacing w:after="120" w:line="276" w:lineRule="auto"/>
+        <w:rPr>
+          <w:rFonts w:ascii="Times New Roman" w:hAnsi="Times New Roman" w:cs="Times New Roman"/>
+        </w:rPr>
+      </w:pPr>
+      <w:r>
+        <w:rPr>
+          <w:rFonts w:ascii="Times New Roman" w:hAnsi="Times New Roman" w:cs="Times New Roman"/>
+          <w:i/>
+          <w:sz w:val="24"/>
+          <w:szCs w:val="24"/>
+        </w:rPr>
+        <w:t xml:space="preserve">Pour les sociétés faisant appel public à l’épargne, le droit de participer à l’assemblée sera subordonné à l’enregistrement comptable des actions au nom de l’actionnaire, au jour de l’assemblée générale, dans les comptes de titres nominatifs tenus par la société ou dans les comptes de titres au porteur tenus par un intermédiaire financier habilité.</w:t>
       </w:r>
     </w:p>
     <w:p>

</xml_diff>